<commit_message>
Fix admin review material save conflict
</commit_message>
<xml_diff>
--- a/public/templates/authorization-letter.docx
+++ b/public/templates/authorization-letter.docx
@@ -157,7 +157,7 @@
       <w:pPr>
         <w:pStyle w:val="a3"/>
         <w:spacing w:line="276" w:lineRule="auto"/>
-        <w:ind w:firstLineChars="150" w:firstLine="471"/>
+        <w:ind w:firstLineChars="150" w:firstLine="480"/>
         <w:rPr>
           <w:rFonts w:ascii="SimSun" w:eastAsia="SimSun" w:hAnsi="SimSun" w:cs="새굴림"/>
           <w:b/>
@@ -254,7 +254,7 @@
       <w:pPr>
         <w:pStyle w:val="a3"/>
         <w:spacing w:line="276" w:lineRule="auto"/>
-        <w:ind w:firstLineChars="150" w:firstLine="471"/>
+        <w:ind w:firstLineChars="150" w:firstLine="480"/>
         <w:rPr>
           <w:rFonts w:ascii="Arial Unicode MS" w:eastAsia="SimSun" w:hAnsi="Arial Unicode MS" w:cs="Arial Unicode MS"/>
           <w:b/>
@@ -319,7 +319,7 @@
       <w:pPr>
         <w:pStyle w:val="a3"/>
         <w:spacing w:line="276" w:lineRule="auto"/>
-        <w:ind w:firstLineChars="150" w:firstLine="471"/>
+        <w:ind w:firstLineChars="150" w:firstLine="480"/>
         <w:rPr>
           <w:rFonts w:ascii="Arial Unicode MS" w:eastAsia="Arial Unicode MS" w:hAnsi="Arial Unicode MS" w:cs="Arial Unicode MS"/>
           <w:b/>
@@ -395,7 +395,7 @@
       <w:pPr>
         <w:pStyle w:val="a3"/>
         <w:spacing w:line="276" w:lineRule="auto"/>
-        <w:ind w:firstLineChars="150" w:firstLine="471"/>
+        <w:ind w:firstLineChars="150" w:firstLine="480"/>
         <w:rPr>
           <w:rFonts w:ascii="Arial Unicode MS" w:eastAsia="Arial Unicode MS" w:hAnsi="Arial Unicode MS" w:cs="Arial Unicode MS"/>
           <w:b/>
@@ -866,7 +866,7 @@
           <w:tab w:val="left" w:pos="24800"/>
         </w:tabs>
         <w:spacing w:line="420" w:lineRule="auto"/>
-        <w:ind w:firstLineChars="350" w:firstLine="1237"/>
+        <w:ind w:firstLineChars="350" w:firstLine="1261"/>
         <w:rPr>
           <w:rFonts w:ascii="Arial Unicode MS" w:eastAsia="Arial Unicode MS" w:hAnsi="Arial Unicode MS" w:cs="Arial Unicode MS"/>
           <w:b/>
@@ -1313,7 +1313,7 @@
         <w:spacing w:line="240" w:lineRule="auto"/>
         <w:jc w:val="center"/>
         <w:rPr>
-          <w:rFonts w:ascii="Arial Unicode MS" w:eastAsia="Arial Unicode MS" w:hAnsi="Arial Unicode MS" w:cs="Arial Unicode MS"/>
+          <w:rFonts w:ascii="Arial Unicode MS" w:eastAsia="Arial Unicode MS" w:hAnsi="Arial Unicode MS" w:cs="Arial Unicode MS" w:hint="eastAsia"/>
           <w:b/>
           <w:bCs/>
           <w:spacing w:val="-14"/>
@@ -1329,8 +1329,31 @@
           <w:sz w:val="56"/>
           <w:szCs w:val="56"/>
         </w:rPr>
-        <w:t>한 라 대 학 교</w:t>
-      </w:r>
+        <w:t>한라대학교</w:t>
+      </w:r>
+      <w:r>
+        <w:rPr>
+          <w:rFonts w:ascii="Arial Unicode MS" w:eastAsia="Arial Unicode MS" w:hAnsi="Arial Unicode MS" w:cs="Arial Unicode MS" w:hint="eastAsia"/>
+          <w:b/>
+          <w:bCs/>
+          <w:sz w:val="56"/>
+          <w:szCs w:val="56"/>
+          <w:lang w:eastAsia="zh-CN"/>
+        </w:rPr>
+        <w:t xml:space="preserve"> </w:t>
+      </w:r>
+      <w:proofErr w:type="spellStart"/>
+      <w:r>
+        <w:rPr>
+          <w:rFonts w:ascii="Arial Unicode MS" w:eastAsia="Arial Unicode MS" w:hAnsi="Arial Unicode MS" w:cs="Arial Unicode MS" w:hint="eastAsia"/>
+          <w:b/>
+          <w:bCs/>
+          <w:sz w:val="56"/>
+          <w:szCs w:val="56"/>
+        </w:rPr>
+        <w:t>글로컬인재처</w:t>
+      </w:r>
+      <w:proofErr w:type="spellEnd"/>
     </w:p>
     <w:p>
       <w:pPr>
@@ -1356,24 +1379,136 @@
           <w:sz w:val="48"/>
           <w:szCs w:val="48"/>
         </w:rPr>
-        <w:t>Halla</w:t>
-      </w:r>
-      <w:proofErr w:type="spellEnd"/>
-      <w:r>
-        <w:rPr>
-          <w:rFonts w:ascii="Arial Unicode MS" w:eastAsia="Arial Unicode MS" w:hAnsi="Arial Unicode MS" w:cs="Arial Unicode MS"/>
+        <w:t>H</w:t>
+      </w:r>
+      <w:r>
+        <w:rPr>
+          <w:rFonts w:ascii="Arial Unicode MS" w:eastAsia="Arial Unicode MS" w:hAnsi="Arial Unicode MS" w:cs="Arial Unicode MS" w:hint="eastAsia"/>
           <w:b/>
           <w:bCs/>
           <w:spacing w:val="-14"/>
           <w:sz w:val="48"/>
           <w:szCs w:val="48"/>
         </w:rPr>
-        <w:t xml:space="preserve"> University</w:t>
+        <w:t>a</w:t>
+      </w:r>
+      <w:r>
+        <w:rPr>
+          <w:rFonts w:ascii="Arial Unicode MS" w:eastAsia="Arial Unicode MS" w:hAnsi="Arial Unicode MS" w:cs="Arial Unicode MS"/>
+          <w:b/>
+          <w:bCs/>
+          <w:spacing w:val="-14"/>
+          <w:sz w:val="48"/>
+          <w:szCs w:val="48"/>
+        </w:rPr>
+        <w:t>lla</w:t>
+      </w:r>
+      <w:proofErr w:type="spellEnd"/>
+      <w:r>
+        <w:rPr>
+          <w:rFonts w:ascii="Arial Unicode MS" w:eastAsia="Arial Unicode MS" w:hAnsi="Arial Unicode MS" w:cs="Arial Unicode MS"/>
+          <w:b/>
+          <w:bCs/>
+          <w:spacing w:val="-14"/>
+          <w:sz w:val="48"/>
+          <w:szCs w:val="48"/>
+        </w:rPr>
+        <w:t xml:space="preserve"> U</w:t>
+      </w:r>
+      <w:r>
+        <w:rPr>
+          <w:rFonts w:ascii="Arial Unicode MS" w:eastAsia="Arial Unicode MS" w:hAnsi="Arial Unicode MS" w:cs="Arial Unicode MS"/>
+          <w:b/>
+          <w:bCs/>
+          <w:spacing w:val="-14"/>
+          <w:sz w:val="48"/>
+          <w:szCs w:val="48"/>
+        </w:rPr>
+        <w:t>niversity</w:t>
+      </w:r>
+      <w:r>
+        <w:rPr>
+          <w:rFonts w:ascii="Arial Unicode MS" w:eastAsia="Arial Unicode MS" w:hAnsi="Arial Unicode MS" w:cs="Arial Unicode MS"/>
+          <w:b/>
+          <w:bCs/>
+          <w:spacing w:val="-14"/>
+          <w:sz w:val="48"/>
+          <w:szCs w:val="48"/>
+        </w:rPr>
+        <w:t xml:space="preserve"> </w:t>
+      </w:r>
+      <w:proofErr w:type="spellStart"/>
+      <w:r>
+        <w:rPr>
+          <w:rFonts w:ascii="Arial Unicode MS" w:eastAsia="Arial Unicode MS" w:hAnsi="Arial Unicode MS" w:cs="Arial Unicode MS"/>
+          <w:b/>
+          <w:bCs/>
+          <w:spacing w:val="-14"/>
+          <w:sz w:val="48"/>
+          <w:szCs w:val="48"/>
+        </w:rPr>
+        <w:t>G</w:t>
+      </w:r>
+      <w:r>
+        <w:rPr>
+          <w:rFonts w:ascii="Arial Unicode MS" w:eastAsia="Arial Unicode MS" w:hAnsi="Arial Unicode MS" w:cs="Arial Unicode MS"/>
+          <w:b/>
+          <w:bCs/>
+          <w:spacing w:val="-14"/>
+          <w:sz w:val="48"/>
+          <w:szCs w:val="48"/>
+        </w:rPr>
+        <w:t>local</w:t>
+      </w:r>
+      <w:proofErr w:type="spellEnd"/>
+      <w:r>
+        <w:rPr>
+          <w:rFonts w:ascii="Arial Unicode MS" w:eastAsia="Arial Unicode MS" w:hAnsi="Arial Unicode MS" w:cs="Arial Unicode MS"/>
+          <w:b/>
+          <w:bCs/>
+          <w:spacing w:val="-14"/>
+          <w:sz w:val="48"/>
+          <w:szCs w:val="48"/>
+        </w:rPr>
+        <w:t xml:space="preserve"> T</w:t>
+      </w:r>
+      <w:r>
+        <w:rPr>
+          <w:rFonts w:ascii="Arial Unicode MS" w:eastAsia="Arial Unicode MS" w:hAnsi="Arial Unicode MS" w:cs="Arial Unicode MS"/>
+          <w:b/>
+          <w:bCs/>
+          <w:spacing w:val="-14"/>
+          <w:sz w:val="48"/>
+          <w:szCs w:val="48"/>
+        </w:rPr>
+        <w:t>alent</w:t>
+      </w:r>
+      <w:r>
+        <w:rPr>
+          <w:rFonts w:ascii="Arial Unicode MS" w:eastAsia="Arial Unicode MS" w:hAnsi="Arial Unicode MS" w:cs="Arial Unicode MS"/>
+          <w:b/>
+          <w:bCs/>
+          <w:spacing w:val="-14"/>
+          <w:sz w:val="48"/>
+          <w:szCs w:val="48"/>
+        </w:rPr>
+        <w:t xml:space="preserve"> A</w:t>
+      </w:r>
+      <w:r>
+        <w:rPr>
+          <w:rFonts w:ascii="Arial Unicode MS" w:eastAsia="Arial Unicode MS" w:hAnsi="Arial Unicode MS" w:cs="Arial Unicode MS"/>
+          <w:b/>
+          <w:bCs/>
+          <w:spacing w:val="-14"/>
+          <w:sz w:val="48"/>
+          <w:szCs w:val="48"/>
+        </w:rPr>
+        <w:t>ffairs</w:t>
       </w:r>
     </w:p>
     <w:sectPr>
       <w:pgSz w:w="11906" w:h="16838"/>
-      <w:pgMar w:top="1440" w:right="1080" w:bottom="1440" w:left="1080" w:header="851" w:footer="992" w:gutter="0"/>
+      <w:pgMar w:top="720" w:right="720" w:bottom="720" w:left="720" w:header="851" w:footer="992" w:gutter="0"/>
       <w:cols w:space="425"/>
       <w:docGrid w:linePitch="360"/>
     </w:sectPr>

</xml_diff>